<commit_message>
Rename Section 6 subsections to parallel house-style titles
Apply the recommended title set: 6.1 Architecture Comparison,
6.3 The Value of Retrieval: An Ablation Study, 6.4 Locating the
Performance Bottlenecks, 6.5 Tabular Data Extraction, 6.6 The
Deployed User Interface. Regenerate the Word build.

Co-Authored-By: Claude Opus 4.8 <noreply@anthropic.com>
</commit_message>
<xml_diff>
--- a/reports/revised_final_report_ver_2.docx
+++ b/reports/revised_final_report_ver_2.docx
@@ -3995,7 +3995,7 @@
         <w:pStyle w:val="Heading2"/>
       </w:pPr>
       <w:r>
-        <w:t>6.1 Comparative Performance</w:t>
+        <w:t>6.1 Architecture Comparison</w:t>
       </w:r>
     </w:p>
     <w:p>
@@ -4734,7 +4734,7 @@
         <w:pStyle w:val="Heading2"/>
       </w:pPr>
       <w:r>
-        <w:t>6.3 The Value of Retrieval: A Value-Added Ablation</w:t>
+        <w:t>6.3 The Value of Retrieval: An Ablation Study</w:t>
       </w:r>
     </w:p>
     <w:p>
@@ -5420,7 +5420,7 @@
         <w:pStyle w:val="Heading2"/>
       </w:pPr>
       <w:r>
-        <w:t>6.4 Why Answer Correctness Is Bounded, and Why the Advanced Pipelines Underperformed</w:t>
+        <w:t>6.4 Locating the Performance Bottlenecks</w:t>
       </w:r>
     </w:p>
     <w:p>
@@ -5516,7 +5516,7 @@
         <w:pStyle w:val="Heading2"/>
       </w:pPr>
       <w:r>
-        <w:t>6.5 Challenges in Tabular Data Extraction</w:t>
+        <w:t>6.5 Tabular Data Extraction</w:t>
       </w:r>
     </w:p>
     <w:p>
@@ -5529,7 +5529,7 @@
         <w:pStyle w:val="Heading2"/>
       </w:pPr>
       <w:r>
-        <w:t>6.6 Deployable Prototype (User Interface)</w:t>
+        <w:t>6.6 The Deployed User Interface</w:t>
       </w:r>
     </w:p>
     <w:p>

</xml_diff>

<commit_message>
Center figure titles; clarify §2.1 vector store and §2.4 bi-encoder
Center all in-figure chart titles (header() now anchors the title at
the SVG midpoint), regenerate SVGs and 2x PNGs, and rebuild the docx.
Also: §2.1 "stored in a vector store (Chroma)" replaces "an index",
and §2.4 reworks the bi-encoder limitation into a single cause-effect
sentence.

Co-Authored-By: Claude Opus 4.8 <noreply@anthropic.com>
</commit_message>
<xml_diff>
--- a/reports/revised_final_report_ver_2.docx
+++ b/reports/revised_final_report_ver_2.docx
@@ -646,12 +646,12 @@
     </w:p>
     <w:p>
       <w:r>
-        <w:t>Without an external source of information, a language model answers from the parameters it acquired during training. For a corpus such as PIRLS, this is inadequate. The model may not have encountered the documents during training, and even where it has, it cannot indicate the page from which a fact originates, so a confident answer cannot be verified. Retrieval-Augmented Generation (Lewis et al., 2020) addresses this limitation. Rather than relying on the model's recall, it supplies the relevant source passages to the model at the time of answering, so that the model operates on text that is explicitly available to it and every claim can be traced to a document.</w:t>
+        <w:t>Without an external source of information, a language model answers from the parameters it acquired during training. For a corpus such as PIRLS, this is inadequate sincethe model may not have encountered the documents during training so a confident answer cannot be verified. Retrieval-Augmented Generation (Lewis et al., 2020) addresses this limitation. Rather than relying on the model's recall, it supplies the relevant source passages to the model at the time of answering, so that the model operates on text that is explicitly available to it and every claim can be traced to a document.</w:t>
       </w:r>
     </w:p>
     <w:p>
       <w:r>
-        <w:t>The method operates in two phases. The first is performed once, before any question is posed. Each document is divided into chunks of a few hundred words, and every chunk is processed by an embedding model that converts it into a vector — a sequence of numbers positioned such that passages with similar content occupy nearby regions of a high-dimensional space. These vectors are stored in an index. The second phase occurs at query time. The question is embedded by the same model, and the system compares the question's vector against each chunk's vector using cosine similarity, the cosine of the angle between them:</w:t>
+        <w:t>The method operates in two phases. The first is performed once, before any question is posed. Each document is divided into chunks of a few hundred words, and every chunk is processed by an embedding model that converts it into a vector — a sequence of numbers positioned such that passages with similar content occupy nearby regions of a high-dimensional space. These vectors are stored in a vector store (here, Chroma). The second phase occurs at query time. The question is embedded by the same model, and the system compares the question's vector against each chunk's vector using cosine similarity, the cosine of the angle between them:</w:t>
       </w:r>
     </w:p>
     <w:p>
@@ -722,7 +722,7 @@
     </w:p>
     <w:p>
       <w:r>
-        <w:t xml:space="preserve">In this elementary form, the parameter of greatest consequence is </w:t>
+        <w:t xml:space="preserve">In this basic form, the most important parameter is </w:t>
       </w:r>
       <m:oMath>
         <m:r>
@@ -775,12 +775,12 @@
         </m:r>
       </m:oMath>
       <w:r>
-        <w:t xml:space="preserve"> positions are passed to the prompt, and any that are off-topic become noise that the model must accommodate. Corrective RAG (CRAG; Yan et al., 2024) introduces a verification step between retrieval and generation. Each retrieved chunk is assessed for relevance; those judged irrelevant are removed, and if too little context remains, the system may retrieve again or revert to the original set. The objective is to refine the context before the generator processes it.</w:t>
+        <w:t xml:space="preserve"> positions are passed to the prompt, and any that are off-topic become noise. Corrective RAG (CRAG; Yan et al., 2024) introduces a verification step between retrieval and generation. Each retrieved chunk is assessed for relevance; those judged irrelevant are removed, and if too little context remains, the system may retrieve again or revert to the original set. The objective is to refine the context before the generator processes it.</w:t>
       </w:r>
     </w:p>
     <w:p>
       <w:r>
-        <w:t>The effectiveness of this step depends entirely on the quality of the judge, and its consequences are asymmetric. A reliable judge removes genuine distractors while preserving the answer-bearing chunks, to the generator's benefit. An unreliable judge causes harm, because the step can only remove chunks and cannot recover one that was wrongly discarded. When a chunk containing the answer is removed, recall decreases and no subsequent stage can compensate. §6.4 demonstrates that the lightweight grader incorporated into our first agentic pipeline discards answer-bearing chunks often enough that, on this corpus, the correction step lowers answer quality rather than improving it.</w:t>
+        <w:t>The effectiveness of this step depends entirely on the quality of the judge. A reliable judge removes genuine distractors while preserving the answer-bearing chunks. An unreliable judge causes harm, because the step can only remove chunks and cannot recover one that was wrongly discarded. When a chunk containing the answer is removed, recall decreases and no subsequent stage can compensate. §6.4 demonstrates that the lightweight grader incorporated into our first agentic pipeline discards answer-bearing chunks often enough that the correction step lowers answer quality rather than improving it.</w:t>
       </w:r>
     </w:p>
     <w:p>
@@ -793,12 +793,12 @@
     </w:p>
     <w:p>
       <w:r>
-        <w:t>Dense retrieval, the cosine-similarity search described above, is effective at capturing meaning. A query concerning "young readers' attitudes toward books" will retrieve passages on reading motivation even when those exact words do not appear. This strength is also a limitation. Because dense retrieval matches on meaning rather than surface form, it may overlook the single literal term on which a question depends. Country names, study acronyms, and identifiers such as "PIRLS" or a specific benchmark label are not always positioned closely in embedding space, so a question that depends on one of them may return plausible but incorrect passages.</w:t>
+        <w:t>Dense retrieval, the cosine-similarity search described above, is effective at capturing semantic meaning. A query concerning _"young readers' attitudes toward books"_ will retrieve passages on reading motivation even when those exact words do not appear. However, since dense retrieval matches on meaning rather than word form, it may overlook the single literal term on which a question depends. Country names, study acronyms, and identifiers such as _"PIRLS"_ or a specific benchmark label are not always positioned closely in embedding space, so a question that depends on one of them may return plausible but incorrect passages.</w:t>
       </w:r>
     </w:p>
     <w:p>
       <w:r>
-        <w:t>The established remedy is lexical search. BM25 (Robertson &amp; Zaragoza, 2009) scores a chunk according to how frequently the query's terms occur within it, assigning greater weight to rare and discriminating terms than to common ones and discounting chunks that score highly only by virtue of their length:</w:t>
+        <w:t>The established remedy is lexical search. BM25 (Robertson &amp; Zaragoza, 2009) scores a chunk according to how frequently the query's terms occur within it, assigning greater weight to rare and discriminating terms than to common ones and discounting chunks that score highly based only by their length:</w:t>
       </w:r>
     </w:p>
     <w:p>
@@ -1009,7 +1009,7 @@
         </m:r>
       </m:oMath>
       <w:r>
-        <w:t xml:space="preserve"> are small tuning constants. The practical consequence is that BM25 reliably locates the chunk that literally contains "Germany" or "plausible values," the case in which dense search is least dependable.</w:t>
+        <w:t xml:space="preserve"> are small tuning constants. As a result, BM25 can reliably locates the chunk that contains "Germany" or "plausible values," in which dense search is least dependable.</w:t>
       </w:r>
     </w:p>
     <w:p>
@@ -1138,7 +1138,7 @@
     </w:p>
     <w:p>
       <w:r>
-        <w:t>The retrievers described above are fast because they process the question and each chunk independently. The embedding model encodes the query once and every chunk once, in advance (computed during indexing, before any question is asked), after which retrieval reduces to a nearest-neighbour lookup over millions of precomputed vectors. This arrangement, termed a bi-encoder, scales readily to a large index, but its speed entails a limitation. The query and the chunk are never processed together, so the similarity score is only an approximation of the chunk's true relevance.</w:t>
+        <w:t>The retrievers described above are fast because they process the question and each chunk independently. The embedding model encodes the query once and every chunk once, in advance (computed during indexing, before any question is asked), after which retrieval reduces to a nearest-neighbour lookup over millions of precomputed vectors. This arrangement, termed a bi-encoder, scales readily to a large index. However, encoding the query and the chunks separately carries a limitation. Since the two are never processed together, the similarity score is only an approximation of the chunk's true relevance.</w:t>
       </w:r>
     </w:p>
     <w:p>
@@ -2278,12 +2278,7 @@
     </w:p>
     <w:p>
       <w:r>
-        <w:t>The original prototype was built and tested on an Alienware M18 (Intel Core i9-13980HX, NVIDIA RTX 4090 Laptop GPU 16 GB, 64 GB RAM); we avoided cloud GPUs to keep the system offline and to stress-test it under realistic local constraints. The re-evaluation here, covering the improvement experiments in §6 and §7, ran on a different machine because access to the RTX 4090 laptop was limited at the time: an Intel Core Ultra 9 (16 cores), 32 GB RAM, and an Intel Arc Pro 140T GPU (16 GB). Both are workstation-class but not equivalent — the Arc laptop has roughly half the RAM and a different GPU and driver stack.</w:t>
-      </w:r>
-    </w:p>
-    <w:p>
-      <w:r>
-        <w:t>This matters in one specific way. Because the two rounds ran on different hardware, the response-time figures in this revision are not comparable to the latency in the original report, nor to absolute figures from any other machine. They remain valid for relative comparison within the re-evaluation runs — Basic versus Advanced, local versus API — which is the only way we use them. The quality metrics (context precision and recall, faithfulness, and answer correctness) are hardware-independent and unaffected. The deployment implications of running on a single machine are discussed in §8.2.</w:t>
+        <w:t>The original prototype was built and tested on an Alienware M18 (Intel Core i9-13980HX, NVIDIA RTX 4090 Laptop GPU 16 GB, 64 GB RAM); we avoided cloud GPUs to keep the system offline and to stress-test it under realistic local constraints. The re-evaluation here, covering the improvement experiments in §6 and §7, ran on a different machine because access to the RTX 4090 laptop was limited at the time. The machine used in the re-evaluation was an Intel Core Ultra 9 (16 cores), 32 GB RAM, and an Intel Arc Pro 140T GPU (16 GB). Consequently, the response-time figures in this revision are not comparable to the latency in the original report. The quality metrics (context precision and recall, faithfulness, and answer correctness) are hardware-independent and unaffected. The deployment implications of running on a single machine are discussed in §8.2.</w:t>
       </w:r>
     </w:p>
     <w:p>

</xml_diff>

<commit_message>
Clarify prose across §2–§8 and add dual-judge calibration evidence
Prose edits for clarity and a more technical, straightforward register:
§2.1 vector store, §2.4 bi-encoder, §4.2 generator-axis wording,
§5.2 original-results corrections, §7.1 evaluation-hardening pass,
§8.1 deployment redundancy, and a humanized §8.3 Future Work.

Add a dual-judge calibration result: re-scored the recommended config's
56 disputed low-correctness rows with a stronger judge (gpt-5.5), which
lifted 21% (12/56) above 0.5. Introduced in §7.1 where evaluation
trustworthiness is established and referenced from §8.3; the internal
reviewer-response note records the numbers and reproduction command.
Rebuild the Word file.

Co-Authored-By: Claude Opus 4.8 <noreply@anthropic.com>
</commit_message>
<xml_diff>
--- a/reports/revised_final_report_ver_2.docx
+++ b/reports/revised_final_report_ver_2.docx
@@ -2291,17 +2291,17 @@
     </w:p>
     <w:p>
       <w:r>
-        <w:t>The choice of models follows from the privacy goal. Since the aim is to keep data on the organization's own hardware, the generator has to be an open-weight model that can run locally; a closed, cloud-hosted model would send every query and every retrieved passage to an external server, which is the situation this project exists to avoid. That ruled out the commercial APIs as the default and ruled in the open-weight families.</w:t>
+        <w:t>The choice of models follows from the privacy goal. Since the aim is to keep data on the organization's own hardware, the generator has to be an open-weight model that can run locally. A closed, cloud-hosted model would send every query and every retrieved passage to an external server, which is the situation this project tries to avoid.</w:t>
       </w:r>
     </w:p>
     <w:p>
       <w:r>
-        <w:t>Model size was the next constraint. Early tests with large models such as Llama-2 70B were unusable on local hardware, with single queries taking minutes (one PIRLS question took 139.46 seconds, another 59.2). We therefore standardized on sub-10B open-weight models, which keep response times usable on a single GPU. Llama 3 (8B) is the primary generator, chosen for its quality at that size. The original report had also evaluated Gemma 3 (4B), which scored on par with Llama 3 8B (answer correctness 0.42 against 0.41); it was not carried forward, since the re-evaluation fixed a single generator and probed strength only at the extremes — a stronger reasoning model, DeepSeek-R1 (8B) (DeepSeek-AI, 2025), and a strong closed model, gpt-5.4-mini. For the controlled three-architecture comparison in §6 the generator is held fixed at llama3:8b so only the pipeline varies; it becomes a separate axis on the best retrieval configuration in §7.2.3, where gpt-5.4-mini serves as an open-versus-closed benchmark — not a deployment candidate, but a measure of how much accuracy the privacy constraint costs.</w:t>
+        <w:t>Model size was the next constraint. Early tests with large models such as Llama-2 70B were unusable on local hardware, with single queries taking minutes (one PIRLS question took 139.46 seconds, another 59.2). We therefore standardized on sub-10B open-weight models, which keep response times usable on a single GPU. Llama 3 (8B) is the primary generator, chosen for its quality at that size. The original report had also evaluated Gemma 3 (4B), which scored on par with Llama 3 8B (answer correctness 0.42 against 0.41). This model was not carried forward, since the re-evaluation fixed a single generator and probed strength only at the extremes — a stronger open-source reasoning model, DeepSeek-R1 (8B) (DeepSeek-AI, 2025), and a strong closed model, gpt-5.4-mini. For the controlled three-architecture comparison in §6 the generator is held fixed at llama3:8b so only the pipeline varies. The generator is then varied on its own in §7.2.3, applied to the best retrieval configuration. There, gpt-5.4-mini serves as an open-versus-closed benchmark to measure how much accuracy the privacy constraint costs.</w:t>
       </w:r>
     </w:p>
     <w:p>
       <w:r>
-        <w:t>Two of the agentic pipelines use a second, smaller model as an internal grader that scores each retrieved chunk for relevance (§2.2). We use gemma3:1b for that role. The grader runs once per chunk and would dominate latency if it were large, so a 1B model is the natural choice for a step intended as an inexpensive filter. §6.4 shows that this economy proves a poor trade-off on this corpus, although the reasoning behind the choice is conventional.</w:t>
+        <w:t>Two of the agentic pipelines use a second, smaller model as an internal grader that scores each retrieved chunk for relevance (§2.2). We use gemma3:1b for that role. The grader only runs once per chunk and it should not add latency. Therefore we use gemma3:1b for that role. However, §6.4 shows that this economy proves a poor trade-off on this corpus.</w:t>
       </w:r>
     </w:p>
     <w:p>
@@ -3954,12 +3954,12 @@
     </w:p>
     <w:p>
       <w:r>
-        <w:t>That gap does not mean the system behaved differently; it reflects a measurement error that we corrected. The Advanced pipeline retrieved the same chunks as Basic, but its context had been logged in a format that drives the ranking metrics toward zero. Re-scoring the same retrieval, logged correctly, returns Advanced's precision and recall to Basic's range, so the near-doubling of the precision gap reported in the original report largely disappears here. §7.1 explains the mechanism in full.</w:t>
+        <w:t>That gap is a measurement error, not a change in system behavior. The Advanced pipeline retrieved the same chunks as Basic, but logged them in a format that drove the ranking metrics toward zero. Re-scoring the identical retrieval from a correct log restores Advanced's precision and recall to Basic's range, which removes most of the precision gap reported originally. §7.1 details the mechanism.</w:t>
       </w:r>
     </w:p>
     <w:p>
       <w:r>
-        <w:t xml:space="preserve">The Basic pipeline was never affected by that logging bug, yet its scores still changed — context recall from 0.54 to 0.80, precision from 0.62 to 0.74. These gains derive from fixing the prototype and hardening the evaluation. The re-evaluation repaired a retrieval defect, set the retrieval depth to k = 4, logged the retrieved context as a proper chunk list, and held a single judge constant across every run. The embedding model was </w:t>
+        <w:t xml:space="preserve">The logging bug did not affect Basic, yet its scores still changed: context recall rose from 0.54 to 0.80 and precision from 0.62 to 0.74. These gains come from fixing the prototype and hardening the evaluation. The re-evaluation repaired a retrieval defect, fixed the retrieval depth at k = 4, logged the retrieved context as a proper chunk list, and held a single judge constant across all runs. The embedding model was </w:t>
       </w:r>
       <w:r>
         <w:rPr>
@@ -3969,12 +3969,12 @@
         <w:t>all-mpnet-base-v2</w:t>
       </w:r>
       <w:r>
-        <w:t xml:space="preserve"> in both the original prototype and this re-evaluation; the original report's reference to "embeddinggemma" was a labelling error (§7.2.4), not a change to the system. The result is a Basic baseline with reliable retrieval metrics where context precision and recall are now measured accurately. Consequently, improvements can be targeted at specific weaknesses and each change validated against a trustworthy score.</w:t>
+        <w:t xml:space="preserve"> in both the original prototype and this re-evaluation; the original report's reference to "embeddinggemma" was a labelling error (§7.2.4), not a system change. The result is a Basic baseline whose context precision and recall are measured accurately, so improvements can target specific weaknesses and each change can be validated against a reliable score.</w:t>
       </w:r>
     </w:p>
     <w:p>
       <w:r>
-        <w:t>Because the two evaluations differ in measurement methodology — a repaired retrieval path, chunk-list context logging, and a single judge held constant across runs — the absolute values in Table 4 are not directly comparable to the re-evaluation results reported elsewhere in this report. Only the within-evaluation ordering is comparable, and it is consistent: Basic outperforms Advanced in both.</w:t>
+        <w:t>The two evaluations differ in measurement methodology: a repaired retrieval path, chunk-list context logging, and a single judge held constant across runs. The absolute values in Table 4 are therefore not directly comparable to the re-evaluation results reported elsewhere in this report. Only the within-evaluation ordering is comparable, and it is consistent: Basic outperforms Advanced in both.</w:t>
       </w:r>
     </w:p>
     <w:p>
@@ -5407,7 +5407,7 @@
     </w:p>
     <w:p>
       <w:r>
-        <w:t>The generation result needs a careful reading. At face value the retrieval-only condition scores 0.827, above full RAG, which would suggest the generator has negative value. It does not. The number is a scoring artifact (Figure 9): the retrieval-only "answer" is a roughly 4,000-character dump of the top chunks, and the answer-correctness metric rewards how many reference facts are present without penalizing length. A long dump that contains the gold facts scores well, while the generator's short synthesis loses points whenever it leaves out a fact to stay concise. A 4,000-character dump is not a usable answer, so the two conditions are not comparable. This fits the rest of the report: the system is limited by retrieval, not by generation. Once the right chunks are retrieved the facts are there, and the generator turns them into a short, attributable answer. Experts who already know the documentation may do fine with the raw chunks; non-experts need the synthesis. Measuring what the generator adds would require a concision or usability metric, not fact coverage alone (§8.3).</w:t>
+        <w:t>The generation result needs a careful reading. At face value the retrieval-only condition scores 0.827, above full RAG, which would suggest the generator has negative value. This is not true. The number is a scoring artifact (Figure 9): the retrieval-only "answer" is a roughly 4,000-character dump of the top chunks, and the answer-correctness metric rewards how many reference facts are present without penalizing length. A long dump that contains the gold facts scores well, while the generator's short synthesis loses points whenever it leaves out a fact to stay concise. A 4,000-character dump is not a usable answer, so the two conditions are not comparable. This fits the rest of the report: the system is limited by retrieval, not by generation. Once the right chunks are retrieved the facts are there, and the generator turns them into a short, attributable answer. Experts in the domain may do fine with the raw chunks, however non-experts need the synthesis. Measuring what the generator adds would require a concision or usability metric, not fact coverage alone (§8.3).</w:t>
       </w:r>
     </w:p>
     <w:p>
@@ -5635,7 +5635,7 @@
     </w:p>
     <w:p>
       <w:r>
-        <w:t>We developed a Streamlit web interface that allows staff to query the PIRLS corpus and view both the answer and the underlying source chunks. It carries IEA branding and provides the controls researchers requested: a choice between the local, privacy-preserving model (llama3:8b via Ollama) and an optional cloud API, a toggle for hybrid-plus-reranker retrieval, and a document-upload panel for ad-hoc corpora. Every answer carries provenance metadata — model, retrieval mode, response time, chunk count — alongside an expandable panel showing the exact source passages. A query such as "What is PIRLS?" returns an answer in about 17 seconds on the local model, with its four source chunks one click away. Grounded answers together with visible sources make the system auditable and suitable for institutional use.</w:t>
+        <w:t>We developed a Streamlit web interface that allows staff to query the PIRLS corpus and view both the answer and the underlying source chunks. It provides the controls between the local, privacy-preserving model (llama3:8b via Ollama) and an optional cloud API, a toggle for hybrid-plus-reranker retrieval, and a document-upload panel for ad-hoc corpora. Every answer carries provenance metadata — model, retrieval mode, response time, chunk count — alongside an expandable panel showing the exact source passages. A query such as "What is PIRLS?" returns an answer in about 17 seconds on the local model, with its four source chunks one click away. Grounded answers together with visible sources make the system auditable and suitable for institutional use.</w:t>
       </w:r>
     </w:p>
     <w:p>
@@ -5651,7 +5651,7 @@
         <w:t>Question.</w:t>
       </w:r>
       <w:r>
-        <w:t xml:space="preserve"> How are achievement items arranged in PIRLS 2021 assessments, and how are they linked for reporting proficiency?</w:t>
+        <w:t xml:space="preserve"> _How are achievement items arranged in PIRLS 2021 assessments, and how are they linked for reporting proficiency?_</w:t>
       </w:r>
     </w:p>
     <w:p>
@@ -5662,7 +5662,7 @@
         <w:t>Answer (llama3:8b).</w:t>
       </w:r>
       <w:r>
-        <w:t xml:space="preserve"> Achievement items in PIRLS 2021 assessments are arranged in blocks that are then assembled into student booklets containing different (but systematically overlapping) sets of item blocks. Statistical and psychometric methods are required to link these different booklets together so that student proficiency can be reported.</w:t>
+        <w:t xml:space="preserve"> _Achievement items in PIRLS 2021 assessments are arranged in blocks that are then assembled into student booklets containing different (but systematically overlapping) sets of item blocks. Statistical and psychometric methods are required to link these different booklets together so that student proficiency can be reported._</w:t>
       </w:r>
     </w:p>
     <w:p>
@@ -5673,7 +5673,7 @@
         <w:t>Top source chunk (one of the four shown to the user).</w:t>
       </w:r>
       <w:r>
-        <w:t xml:space="preserve"> "…these achievement items are arranged in blocks that are then assembled into student booklets containing different (but systematically overlapping) sets of item blocks…" — from the </w:t>
+        <w:t xml:space="preserve"> _"…these achievement items are arranged in blocks that are then assembled into student booklets containing different (but systematically overlapping) sets of item blocks…" — from the </w:t>
       </w:r>
       <w:r>
         <w:rPr>
@@ -5682,7 +5682,7 @@
         <w:t>Methods and Procedures</w:t>
       </w:r>
       <w:r>
-        <w:t xml:space="preserve"> technical report (citing the PIRLS 2021 Assessment Design; Martin et al., 2019).</w:t>
+        <w:t xml:space="preserve"> technical report (citing the PIRLS 2021 Assessment Design; Martin et al., 2019)._</w:t>
       </w:r>
     </w:p>
     <w:p>
@@ -5714,22 +5714,22 @@
     </w:p>
     <w:p>
       <w:r>
-        <w:t>The benchmark proceeded through three passes; only the final one supports valid comparison, and the progression explains the discrepancy with the original report's figures.</w:t>
+        <w:t>The benchmark proceeded through three passes. Only the final pass supports valid comparison, and the progression explains the discrepancy with the original report's figures.</w:t>
       </w:r>
     </w:p>
     <w:p>
       <w:r>
-        <w:t>The first pass used RAGAS and was abandoned partway through: the harness hit a cascade of API-quota errors, local-judge timeouts, and library-version failures, and never produced complete scores for the advanced pipeline. We responded by pinning the evaluation stack and making scoring resilient to single-row failures.</w:t>
+        <w:t>The first pass used RAGAS and was abandoned partway through, after the harness hit a cascade of API-quota errors, local-judge timeouts, and library-version failures and never produced complete scores for the Advanced pipeline. In response we pinned the evaluation stack and made scoring resilient to single-row failures.</w:t>
       </w:r>
     </w:p>
     <w:p>
       <w:r>
-        <w:t>The second pass moved to DeepEval and exposed a measurement artifact. The Advanced pipeline's retrieved context had been logged as a single concatenated blob rather than a list of separate chunks. Context precision and recall are ranking metrics computed over a list, so a single blob drives them toward zero, which inflated the precision and recall gap in the original report. This is a logging problem, not worse retrieval: the Advanced pipeline uses the same retriever and the same query as Basic, so it retrieves the same chunks. Because the retrieved text is identical, a much lower score can only come from how that text was recorded (one blob instead of a chunk list), not from the retrieval itself.</w:t>
+        <w:t>The second pass moved to DeepEval and exposed a measurement artifact. The Advanced pipeline's retrieved context had been logged as a single concatenated blob rather than a list of separate chunks. Context precision and recall are ranking metrics computed over a list, so a single blob drives them toward zero and inflated the precision and recall gap in the original report. The cause is logging, not retrieval: the Advanced pipeline uses the same retriever and query as Basic and retrieves the same chunks, so the lower score reflects only how that text was recorded.</w:t>
       </w:r>
     </w:p>
     <w:p>
       <w:r>
-        <w:t>This report relies on the third pass. It logs every system's context as a chunk list, fixes the retrieval bug, and holds the judge constant, which makes it the first trustworthy three-way comparison. Scores can only be compared within a pass, not across passes, because the harness, embeddings, and judge all changed between them. For example, faithfulness rises between the first two passes, but that reflects the change of framework, not a real improvement.</w:t>
+        <w:t>This report relies on the third pass, which logs every system's context as a chunk list, fixes the retrieval bug, and holds the judge constant, making it the first trustworthy three-way comparison. Scores are comparable only within a pass, because the harness, embeddings, and judge all changed between passes. Faithfulness, for instance, rises between the first two passes, but that reflects the change of framework, not a real improvement.</w:t>
       </w:r>
     </w:p>
     <w:p>
@@ -5786,6 +5786,11 @@
       </w:r>
     </w:p>
     <w:p>
+      <w:r>
+        <w:t>As a lightweight calibration of the judge itself, we re-scored the recommended configuration's disputed low-correctness rows (answer correctness ≤ 0.6 but context precision ≥ 0.5) with a stronger second judge, gpt-5.5. It raised 21% of them (12 of 56) above the 0.5 mark and lowered only 4% (2 of 56), which indicates that a portion of low scores reflect the primary judge under-crediting a correct answer rather than the answer being wrong. A full calibration against human experts remains future work (§8.3).</w:t>
+      </w:r>
+    </w:p>
+    <w:p>
       <w:pPr>
         <w:pStyle w:val="Heading2"/>
       </w:pPr>
@@ -5808,7 +5813,7 @@
     </w:p>
     <w:p>
       <w:r>
-        <w:t>Retrieving the top 20 candidates and re-scoring them with a CPU cross-encoder to keep the best 4 increases answer correctness from 0.473 to 0.625, a 32% gain. Precision rises from 0.741 to 0.837 and recall from 0.796 to 0.837. The gain concentrates on the 40 worst-retrieval rows, where mean precision rises from 0.127 to 0.531 and answer correctness from 0.185 to 0.333. The cost is effectively zero, since the reranker is a local CPU model.</w:t>
+        <w:t>Retrieving the top 20 candidates and re-scoring them with a  cross-encoder to keep the best 4 increases answer correctness from 0.473 to 0.625, a 32% gain. Precision rises from 0.741 to 0.837 and recall from 0.796 to 0.837. The gain concentrates on the 40 worst-retrieval rows, where mean precision rises from 0.127 to 0.531 and answer correctness from 0.185 to 0.333.</w:t>
       </w:r>
     </w:p>
     <w:p>
@@ -6275,7 +6280,7 @@
     </w:p>
     <w:p>
       <w:r>
-        <w:t>Advanced v3 targets the two failures diagnosed in §6.4: v1's grader, which drops answer-bearing chunks and collapses recall, and v2's per-sub-question retrieval, which adds off-topic chunks and collapses precision. The problem is not decomposition itself — roughly a third of the questions are genuinely multi-hop — but how these two versions implement it.</w:t>
+        <w:t>Advanced v3 targets the two failures diagnosed in §6.4: v1's grader, which drops answer-bearing chunks and collapses recall, and v2's per-sub-question retrieval, which adds off-topic chunks and collapses precision. The problem is not decomposition itself but how these two versions implement it.</w:t>
       </w:r>
     </w:p>
     <w:p>
@@ -6661,7 +6666,7 @@
     </w:p>
     <w:p>
       <w:r>
-        <w:t>With the strong closed generator, Advanced v3 reaches an answer correctness of 0.780. That is effectively identical to the Basic pipeline on the same generator and retriever, which scores 0.774 (§7.2.3); the 0.006 gap is well within run-to-run variation. Advanced v3 also comes at higher latency, about 9.9 against 7.9 seconds per query, and materially more engineering complexity. The four fixes achieved precisely what §6.4 predicted: they closed the recall and precision gap that v1's grader and v2's per-sub-question retrieval had opened, and they raised the agentic pipeline from a net-negative architecture to parity with Basic. They did not, however, surpass it. The interpretation is straightforward and consistent with the rest of the report. Once retrieval is fixed with hybrid fusion and reranking, the system is generation-bound, and the agentic orchestration adds cost without adding accuracy on this corpus. We therefore continue to recommend Basic RAG for deployment. The agentic pipeline merits retention as a research direction for genuinely multi-hop workloads, now that it matches the simple pipeline rather than underperforming it, but it is not recommended for default deployment. The full experiment matrix is in Appendix B.</w:t>
+        <w:t>With the strong closed generator model, Advanced v3 reaches an answer correctness of 0.780. That is effectively identical to the Basic pipeline on the same generator and retriever, which scores 0.774 (§7.2.3); the 0.006 gap is well within run-to-run variation. Advanced v3 also comes at higher latency, about 9.9 against 7.9 seconds per query, and materially more engineering complexity. The four fixes achieved precisely what §6.4 predicted which is closing the recall and precision gap between v1's grader and v2's per-sub-question retrieval raised the agentic pipeline from a net-negative architecture to parity with Basic. Hoever, they did not surpass it. The interpretation is consistent with the rest of the report. Once retrieval is fixed with hybrid fusion and reranking, the system is generation-bound, Additionaly, the agentic orchestration adds cost without adding accuracy on this corpus. We therefore continue to recommend Basic RAG for deployment. The full experiment matrix is in Appendix B.</w:t>
       </w:r>
     </w:p>
     <w:p>
@@ -6682,7 +6687,7 @@
     </w:p>
     <w:p>
       <w:r>
-        <w:t>We recommend deploying Basic RAG with hybrid (BM25 plus dense) retrieval and cross-encoder reranking, using the local open llama3:8b generator as the private default. That configuration scores 0.689 on answer correctness, costs essentially nothing to run, and returns an answer in roughly 20 seconds on the re-evaluation laptop, within the 30-second threshold that 80% of staff stated they would accept. Latency will differ on production hardware.</w:t>
+        <w:t>We recommend deploying Basic RAG with hybrid (BM25 plus dense) retrieval and cross-encoder reranking, using the local open llama3:8b generator as the private default. That configuration scores 0.689 on answer correctness and returns an answer in roughly 20 seconds on the re-evaluation laptop, within the 30-second threshold that 80% of staff stated they would accept. Latency will differ on production hardware.</w:t>
       </w:r>
     </w:p>
     <w:p>
@@ -6740,12 +6745,12 @@
     </w:p>
     <w:p>
       <w:r>
-        <w:t>Figure 15 shows the pipeline. Each query runs through two retrievers in parallel: BM25 for exact terms such as country names and study acronyms, and a dense embedding model for meaning. Their results are merged by reciprocal rank fusion into a 20-chunk candidate set, and a cross-encoder reranker re-scores those candidates to keep the best four. The four chunks are passed to a local llama3:8b generator, which returns the answer together with the source chunks behind it. The pipeline stays single-pass — no query decomposition and no document grading — so it keeps the Basic pipeline's low latency, while the two retrieval stages supply the accuracy gains documented in §7.2. Every stage runs on local hardware, so no query or document leaves the premises.</w:t>
+        <w:t>Figure 15 shows the pipeline. Each query runs through two retrievers in parallel: BM25 for exact terms such as country names and study acronyms, and a dense embedding model for sematic meaning. Their results are merged by reciprocal rank fusion into a 20-chunk candidate set, and a cross-encoder reranker re-scores those candidates to keep the best four. The four chunks are passed to a local llama3:8b generator, which returns the answer together with the source chunks behind it. The pipeline stays single-pass — no query decomposition and no document grading — so it keeps the Basic pipeline's low latency, while the two retrieval stages supply the accuracy gains documented in §7.2. Every stage runs on local hardware, so no query or document leaves the premises.</w:t>
       </w:r>
     </w:p>
     <w:p>
       <w:r>
-        <w:t>We do not recommend deploying the agentic pipeline in its current form, since it adds four to five times the latency without improving accuracy. The closed gpt-5.4-mini model should be offered only as an optional higher-accuracy tier for non-sensitive queries.</w:t>
+        <w:t>As §7.3 concluded, the agentic pipeline is not recommended for deployment. The closed gpt-5.4-mini model should be offered only as an optional higher-accuracy tier for non-sensitive queries.</w:t>
       </w:r>
     </w:p>
     <w:p>
@@ -6758,7 +6763,7 @@
     </w:p>
     <w:p>
       <w:r>
-        <w:t>The prototype ran on a single laptop, which determines the latency figures in this report. For organizational use we recommend a local network server rather than per-user installations. A single on-premises GPU server would host the model and the vector index and serve the existing web interface to staff browsers. That keeps data on-premises, which preserves the privacy premise; it centralizes index updates; and it could host a larger local model than a laptop can, which would help address the sub-10B accuracy ceiling. Per-user laptop installations remain viable for offline or field use, but they multiply maintenance and constrain model size. The cloud closed-model tier from §7.2.3 is the only option that leaves the premises, and it is reserved for non-sensitive queries.</w:t>
+        <w:t>The prototype ran on a single laptop, which determines the latency figures in this report. For organizational use we recommend a local network server rather than per-user installations. A single on-premises GPU server would host the model and the vector index and serve the existing web interface to staff browsers. That keeps data on-premises, centralizes index updates and it could host a larger local model than a laptop can, which would help address the sub-10B accuracy ceiling. The cloud closed-model tier from §7.2.3 is reserved for non-sensitive queries.</w:t>
       </w:r>
     </w:p>
     <w:p>
@@ -6771,32 +6776,51 @@
     </w:p>
     <w:p>
       <w:r>
-        <w:t>These findings point to clear next steps, in rough priority order.</w:t>
+        <w:t>These findings point to several next steps.</w:t>
       </w:r>
     </w:p>
     <w:p>
       <w:r>
-        <w:t>The most important is a calibrated human-expert evaluation. Subject-matter experts should grade a representative subset, both to calibrate the LLM judge against expert judgement and to test whether a given score is good enough for professional use. We did not build expert-grading infrastructure in this phase. Two things already lessen the concern. The best configuration scores 0.774 on answer correctness and 0.865 on precision, both well clear of the 0.5 mark where adequacy would be in question. And a small cross-check with a second judge suggests that some low scores are the judge under-crediting a correct answer rather than the answer being wrong, so the real quality may be a little higher than measured. A formal expert study is still the right next step.</w:t>
+        <w:t>The most important is human-expert evaluation. Subject-matter experts should grade a representative subset, both to calibrate the LLM judge and to test whether a given score is good enough for professional use. Two observations lessen the concern in the meantime: the best configuration scores 0.774 on answer correctness and 0.865 on precision, both well clear of the 0.5 adequacy mark, and the dual-judge cross-check in §7.1 indicates that some low scores reflect judge under-credit rather than wrong answers, so true quality may be slightly higher than measured. A formal expert study remains the right next step.</w:t>
       </w:r>
     </w:p>
     <w:p>
       <w:r>
-        <w:t>Next is validation on internal, non-public documents. The privacy premise is best shown on the material it protects, but this evaluation used only public PIRLS documentation. This is the main external-validity limitation, and a key next step once data-governance approval is in place.</w:t>
+        <w:t>The evaluation set also needs more reasoning-heavy questions. It is currently about 68% fact-retrieval and under-samples methodological "why and how" questions (§4.4.1). A follow-up evaluation set should include more questions on sampling design, weighting, and plausible values.</w:t>
       </w:r>
     </w:p>
     <w:p>
       <w:r>
-        <w:t>The evaluation set also needs more reasoning-heavy questions. It is currently about 68% fact-retrieval and under-samples methodological "why and how" questions (§4.4.1); a follow-up should over-sample sampling, weighting, and plausible values.</w:t>
+        <w:t>Retrieval can likely be improved further. Contextual retrieval (Anthropic, 2024) prepends a short LLM-generated summary to each chunk before embedding, so the chunk keeps the document context that plain chunking removes. Anthropic reports that this cuts retrieval failures substantially. It applies on top of the recommended hybrid-plus-rerank stack and costs only a one-time indexing pass with the local model.</w:t>
       </w:r>
     </w:p>
     <w:p>
       <w:r>
-        <w:t>Retrieval itself can probably be pushed further still. Contextual retrieval (Anthropic, 2024), which prepends a short LLM-generated summary to each chunk before indexing, is a natural next lever on top of the recommended hybrid-plus-rerank stack and has been reported to cut retrieval failures substantially; its one-time cost is an indexing pass with the local model.</w:t>
+        <w:t>Three engineering directions would also help:</w:t>
       </w:r>
     </w:p>
     <w:p>
-      <w:r>
-        <w:t>Three engineering directions would help as well: a concision or usability metric, since the current fact-coverage metric rewards a raw chunk dump as highly as a concise answer and so cannot credit what the generator adds (§6.3); high-fidelity table extraction with specialized parsers (Docling, Auer et al., 2024; Marker; PaddleOCR's PP-StructureV2, Li et al., 2022), or vision-based RAG that retrieves over page images and skips text extraction entirely (ColPali, Faysse et al., 2024; VisRAG, Yu et al., 2025), for the table problem (§6.5); and latency optimization through quantization (AWQ; Lin et al., 2024), efficient serving (vLLM; Kwon et al., 2023), and prefix caching (SGLang; Zheng et al., 2024) to push the local tier below 10 seconds and make room for larger models on a server.</w:t>
+      <w:pPr>
+        <w:pStyle w:val="ListBullet"/>
+      </w:pPr>
+      <w:r>
+        <w:t>A concision or usability metric, because the current fact-coverage metric rewards a raw chunk dump as highly as a concise answer and cannot credit what the generator adds (§6.3).</w:t>
+      </w:r>
+    </w:p>
+    <w:p>
+      <w:pPr>
+        <w:pStyle w:val="ListBullet"/>
+      </w:pPr>
+      <w:r>
+        <w:t>High-fidelity table extraction, using specialized parsers (Docling, Auer et al., 2024; Marker; PaddleOCR's PP-StructureV2, Li et al., 2022) or vision-based RAG that retrieves over page images and skips text extraction entirely (ColPali, Faysse et al., 2024; VisRAG, Yu et al., 2025), for the table problem (§6.5).</w:t>
+      </w:r>
+    </w:p>
+    <w:p>
+      <w:pPr>
+        <w:pStyle w:val="ListBullet"/>
+      </w:pPr>
+      <w:r>
+        <w:t>Latency optimization through quantization (AWQ; Lin et al., 2024), efficient serving (vLLM; Kwon et al., 2023), and prefix caching (SGLang; Zheng et al., 2024), to push the local tier below 10 seconds and make room for larger models on a server.</w:t>
       </w:r>
     </w:p>
     <w:p>

</xml_diff>

<commit_message>
Remove gpt-5.5 cross-check from report; tighten §8.4 Limitations
Drop the dual-judge calibration finding (§7.1 paragraph + table, §8.3
back-reference) and renumber the downstream tables back to 1-8; revert
the matching mitigation in the internal reviewer-response note.

Tighten §8.4: collapse the three limitations that merely mirror §8.3
future work into one cross-referenced clause, leaving room for the
caveats unique to the section (PDF artifacts, no significance tests,
hardware-specific latency). Rebuild the Word file.

Co-Authored-By: Claude Opus 4.8 <noreply@anthropic.com>
</commit_message>
<xml_diff>
--- a/reports/revised_final_report_ver_2.docx
+++ b/reports/revised_final_report_ver_2.docx
@@ -5786,11 +5786,6 @@
       </w:r>
     </w:p>
     <w:p>
-      <w:r>
-        <w:t>As a lightweight calibration of the judge itself, we re-scored the recommended configuration's disputed low-correctness rows (answer correctness ≤ 0.6 but context precision ≥ 0.5) with a stronger second judge, gpt-5.5. It raised 21% of them (12 of 56) above the 0.5 mark and lowered only 4% (2 of 56), which indicates that a portion of low scores reflect the primary judge under-crediting a correct answer rather than the answer being wrong. A full calibration against human experts remains future work (§8.3).</w:t>
-      </w:r>
-    </w:p>
-    <w:p>
       <w:pPr>
         <w:pStyle w:val="Heading2"/>
       </w:pPr>
@@ -6781,7 +6776,7 @@
     </w:p>
     <w:p>
       <w:r>
-        <w:t>The most important is human-expert evaluation. Subject-matter experts should grade a representative subset, both to calibrate the LLM judge and to test whether a given score is good enough for professional use. Two observations lessen the concern in the meantime: the best configuration scores 0.774 on answer correctness and 0.865 on precision, both well clear of the 0.5 adequacy mark, and the dual-judge cross-check in §7.1 indicates that some low scores reflect judge under-credit rather than wrong answers, so true quality may be slightly higher than measured. A formal expert study remains the right next step.</w:t>
+        <w:t>The most important is human-expert evaluation. Subject-matter experts should grade a representative subset, both to calibrate the LLM judge and to test whether a given score is good enough for professional use. One observation lessens the concern in the meantime: the best configuration scores 0.774 on answer correctness and 0.865 on precision, both well clear of the 0.5 adequacy mark. A formal expert study remains the right next step.</w:t>
       </w:r>
     </w:p>
     <w:p>
@@ -6833,7 +6828,7 @@
     </w:p>
     <w:p>
       <w:r>
-        <w:t>The results are bounded in several ways that should be stated explicitly. The corpus is a single-domain, public one (PIRLS). PDF-to-text preprocessing introduces artifacts. The LLM judge is not yet calibrated against human experts. The question set is weighted toward fact-retrieval. We did not run formal significance tests, so small differences in answer correctness (a few hundredths of a point) should be read as within run-to-run variation rather than as real gaps. And the latency is hardware-specific: the re-evaluation ran on a different, less capable laptop (the Intel Arc Pro 140T with 32 GB) than the original RTX-4090 prototype, so response times are not comparable across the two reports and are used only for relative comparison within the re-evaluation runs. These bound how far the results generalize, and they motivate the future work above.</w:t>
+        <w:t>The results are bounded in several ways. Three bound how far they generalize and directly motivate the future work above (§8.3): the corpus is single-domain and public (PIRLS), the LLM judge is not yet calibrated against human experts, and the question set is weighted toward fact-retrieval. Three further caveats concern the measurements themselves. PDF-to-text preprocessing introduces artifacts, most visibly in tables (§6.5). We did not run formal significance tests, so small differences in answer correctness (a few hundredths of a point) should be read as run-to-run variation rather than real gaps. And latency is hardware-specific: the re-evaluation ran on a less capable laptop (Intel Arc Pro 140T, 32 GB) than the original RTX-4090 prototype, so response times are not comparable across the two reports and are used only for relative comparison within the re-evaluation runs.</w:t>
       </w:r>
     </w:p>
     <w:p>

</xml_diff>

<commit_message>
Humanize §7.1 evaluation-hardening prose
Remove the "-ing" participle tail ("making it the first trustworthy
three-way comparison") and fix a present/past tense splice in the
DeepEval-pass paragraph. Rebuild the Word file.

Co-Authored-By: Claude Opus 4.8 <noreply@anthropic.com>
</commit_message>
<xml_diff>
--- a/reports/revised_final_report_ver_2.docx
+++ b/reports/revised_final_report_ver_2.docx
@@ -5724,12 +5724,12 @@
     </w:p>
     <w:p>
       <w:r>
-        <w:t>The second pass moved to DeepEval and exposed a measurement artifact. The Advanced pipeline's retrieved context had been logged as a single concatenated blob rather than a list of separate chunks. Context precision and recall are ranking metrics computed over a list, so a single blob drives them toward zero and inflated the precision and recall gap in the original report. The cause is logging, not retrieval: the Advanced pipeline uses the same retriever and query as Basic and retrieves the same chunks, so the lower score reflects only how that text was recorded.</w:t>
+        <w:t>The second pass moved to DeepEval and exposed a measurement artifact. The Advanced pipeline's retrieved context had been logged as a single concatenated blob rather than a list of separate chunks. Context precision and recall are ranking metrics computed over a list, so a single blob drives them toward zero. That is what inflated the precision and recall gap in the original report. The cause is logging, not retrieval: the Advanced pipeline uses the same retriever and query as Basic and retrieves the same chunks, so the lower score reflects only how that text was recorded.</w:t>
       </w:r>
     </w:p>
     <w:p>
       <w:r>
-        <w:t>This report relies on the third pass, which logs every system's context as a chunk list, fixes the retrieval bug, and holds the judge constant, making it the first trustworthy three-way comparison. Scores are comparable only within a pass, because the harness, embeddings, and judge all changed between passes. Faithfulness, for instance, rises between the first two passes, but that reflects the change of framework, not a real improvement.</w:t>
+        <w:t>This report relies on the third pass, which logs every system's context as a chunk list, fixes the retrieval bug, and holds the judge constant. It is the first trustworthy three-way comparison. Scores are comparable only within a pass, because the harness, embeddings, and judge all changed between passes. Faithfulness, for instance, rises between the first two passes, but that reflects the change of framework, not a real improvement.</w:t>
       </w:r>
     </w:p>
     <w:p>

</xml_diff>